<commit_message>
docs(fase2): documentos de evidencias sin fuentes incrustadas
La plantilla de Fase 1 incrusta las fuentes y cada documento pesaba unos 4 MB
más; sin ellas quedan entre 250 KB y 2,3 MB (el de la aplicación, por sus capturas).
</commit_message>
<xml_diff>
--- a/Fase 2/Evidencias Proyecto/Evidencias de documentación/Documento_de_Product_Backlog_e_Historias_de_Usuario_SIGPA_JCifuentes_FGaete_AOlivares.docx
+++ b/Fase 2/Evidencias Proyecto/Evidencias de documentación/Documento_de_Product_Backlog_e_Historias_de_Usuario_SIGPA_JCifuentes_FGaete_AOlivares.docx
@@ -477,7 +477,7 @@
       <w:r>
         <w:fldChar w:fldCharType="separate"/>
       </w:r>
-      <w:hyperlink w:anchor="_Toc244185070" w:history="1">
+      <w:hyperlink w:anchor="_Toc244185705" w:history="1">
         <w:r>
           <w:rPr>
             <w:rStyle w:val="Hipervnculo"/>
@@ -504,7 +504,7 @@
             <w:noProof/>
             <w:webHidden/>
           </w:rPr>
-          <w:instrText xml:space="preserve"> PAGEREF _Toc244185070 \h </w:instrText>
+          <w:instrText xml:space="preserve"> PAGEREF _Toc244185705 \h </w:instrText>
         </w:r>
         <w:r>
           <w:rPr>
@@ -547,7 +547,7 @@
           <w14:ligatures w14:val="standardContextual"/>
         </w:rPr>
       </w:pPr>
-      <w:hyperlink w:anchor="_Toc244185071" w:history="1">
+      <w:hyperlink w:anchor="_Toc244185706" w:history="1">
         <w:r>
           <w:rPr>
             <w:rStyle w:val="Hipervnculo"/>
@@ -574,7 +574,7 @@
             <w:noProof/>
             <w:webHidden/>
           </w:rPr>
-          <w:instrText xml:space="preserve"> PAGEREF _Toc244185071 \h </w:instrText>
+          <w:instrText xml:space="preserve"> PAGEREF _Toc244185706 \h </w:instrText>
         </w:r>
         <w:r>
           <w:rPr>
@@ -617,7 +617,7 @@
           <w14:ligatures w14:val="standardContextual"/>
         </w:rPr>
       </w:pPr>
-      <w:hyperlink w:anchor="_Toc244185072" w:history="1">
+      <w:hyperlink w:anchor="_Toc244185707" w:history="1">
         <w:r>
           <w:rPr>
             <w:rStyle w:val="Hipervnculo"/>
@@ -644,7 +644,7 @@
             <w:noProof/>
             <w:webHidden/>
           </w:rPr>
-          <w:instrText xml:space="preserve"> PAGEREF _Toc244185072 \h </w:instrText>
+          <w:instrText xml:space="preserve"> PAGEREF _Toc244185707 \h </w:instrText>
         </w:r>
         <w:r>
           <w:rPr>
@@ -687,7 +687,7 @@
           <w14:ligatures w14:val="standardContextual"/>
         </w:rPr>
       </w:pPr>
-      <w:hyperlink w:anchor="_Toc244185073" w:history="1">
+      <w:hyperlink w:anchor="_Toc244185708" w:history="1">
         <w:r>
           <w:rPr>
             <w:rStyle w:val="Hipervnculo"/>
@@ -714,7 +714,7 @@
             <w:noProof/>
             <w:webHidden/>
           </w:rPr>
-          <w:instrText xml:space="preserve"> PAGEREF _Toc244185073 \h </w:instrText>
+          <w:instrText xml:space="preserve"> PAGEREF _Toc244185708 \h </w:instrText>
         </w:r>
         <w:r>
           <w:rPr>
@@ -757,7 +757,7 @@
           <w14:ligatures w14:val="standardContextual"/>
         </w:rPr>
       </w:pPr>
-      <w:hyperlink w:anchor="_Toc244185074" w:history="1">
+      <w:hyperlink w:anchor="_Toc244185709" w:history="1">
         <w:r>
           <w:rPr>
             <w:rStyle w:val="Hipervnculo"/>
@@ -784,7 +784,7 @@
             <w:noProof/>
             <w:webHidden/>
           </w:rPr>
-          <w:instrText xml:space="preserve"> PAGEREF _Toc244185074 \h </w:instrText>
+          <w:instrText xml:space="preserve"> PAGEREF _Toc244185709 \h </w:instrText>
         </w:r>
         <w:r>
           <w:rPr>
@@ -827,7 +827,7 @@
           <w14:ligatures w14:val="standardContextual"/>
         </w:rPr>
       </w:pPr>
-      <w:hyperlink w:anchor="_Toc244185075" w:history="1">
+      <w:hyperlink w:anchor="_Toc244185710" w:history="1">
         <w:r>
           <w:rPr>
             <w:rStyle w:val="Hipervnculo"/>
@@ -854,7 +854,7 @@
             <w:noProof/>
             <w:webHidden/>
           </w:rPr>
-          <w:instrText xml:space="preserve"> PAGEREF _Toc244185075 \h </w:instrText>
+          <w:instrText xml:space="preserve"> PAGEREF _Toc244185710 \h </w:instrText>
         </w:r>
         <w:r>
           <w:rPr>
@@ -897,7 +897,7 @@
           <w14:ligatures w14:val="standardContextual"/>
         </w:rPr>
       </w:pPr>
-      <w:hyperlink w:anchor="_Toc244185076" w:history="1">
+      <w:hyperlink w:anchor="_Toc244185711" w:history="1">
         <w:r>
           <w:rPr>
             <w:rStyle w:val="Hipervnculo"/>
@@ -924,7 +924,7 @@
             <w:noProof/>
             <w:webHidden/>
           </w:rPr>
-          <w:instrText xml:space="preserve"> PAGEREF _Toc244185076 \h </w:instrText>
+          <w:instrText xml:space="preserve"> PAGEREF _Toc244185711 \h </w:instrText>
         </w:r>
         <w:r>
           <w:rPr>
@@ -967,7 +967,7 @@
           <w14:ligatures w14:val="standardContextual"/>
         </w:rPr>
       </w:pPr>
-      <w:hyperlink w:anchor="_Toc244185077" w:history="1">
+      <w:hyperlink w:anchor="_Toc244185712" w:history="1">
         <w:r>
           <w:rPr>
             <w:rStyle w:val="Hipervnculo"/>
@@ -994,7 +994,7 @@
             <w:noProof/>
             <w:webHidden/>
           </w:rPr>
-          <w:instrText xml:space="preserve"> PAGEREF _Toc244185077 \h </w:instrText>
+          <w:instrText xml:space="preserve"> PAGEREF _Toc244185712 \h </w:instrText>
         </w:r>
         <w:r>
           <w:rPr>
@@ -1037,7 +1037,7 @@
           <w14:ligatures w14:val="standardContextual"/>
         </w:rPr>
       </w:pPr>
-      <w:hyperlink w:anchor="_Toc244185078" w:history="1">
+      <w:hyperlink w:anchor="_Toc244185713" w:history="1">
         <w:r>
           <w:rPr>
             <w:rStyle w:val="Hipervnculo"/>
@@ -1064,7 +1064,7 @@
             <w:noProof/>
             <w:webHidden/>
           </w:rPr>
-          <w:instrText xml:space="preserve"> PAGEREF _Toc244185078 \h </w:instrText>
+          <w:instrText xml:space="preserve"> PAGEREF _Toc244185713 \h </w:instrText>
         </w:r>
         <w:r>
           <w:rPr>
@@ -1106,7 +1106,7 @@
         <w:pageBreakBefore/>
       </w:pPr>
       <w:bookmarkStart w:id="1" w:name="_2nt386fm33zg" w:colFirst="0" w:colLast="0"/>
-      <w:bookmarkStart w:id="2" w:name="_Toc244185070"/>
+      <w:bookmarkStart w:id="2" w:name="_Toc244185705"/>
       <w:bookmarkEnd w:id="1"/>
       <w:r>
         <w:t>Datos del documento</w:t>
@@ -2172,7 +2172,7 @@
         <w:pageBreakBefore/>
         <w:spacing w:before="360" w:after="120"/>
       </w:pPr>
-      <w:bookmarkStart w:id="5" w:name="_Toc244185071"/>
+      <w:bookmarkStart w:id="5" w:name="_Toc244185706"/>
       <w:r>
         <w:rPr>
           <w:sz w:val="30"/>
@@ -2195,7 +2195,7 @@
         <w:pStyle w:val="Ttulo1"/>
         <w:spacing w:before="360" w:after="120"/>
       </w:pPr>
-      <w:bookmarkStart w:id="6" w:name="_Toc244185072"/>
+      <w:bookmarkStart w:id="6" w:name="_Toc244185707"/>
       <w:r>
         <w:rPr>
           <w:sz w:val="30"/>
@@ -2494,7 +2494,7 @@
           <w:noProof/>
         </w:rPr>
         <w:drawing>
-          <wp:inline distT="0" distB="0" distL="0" distR="0" wp14:anchorId="2EE192F7" wp14:editId="1ECFD48A">
+          <wp:inline distT="0" distB="0" distL="0" distR="0" wp14:anchorId="7F5FC9CA" wp14:editId="18CD3D07">
             <wp:extent cx="5580000" cy="2772000"/>
             <wp:effectExtent l="0" t="0" r="0" b="0"/>
             <wp:docPr id="1001" name="Figura 1"/>
@@ -2546,7 +2546,7 @@
         <w:pStyle w:val="Ttulo1"/>
         <w:spacing w:before="360" w:after="120"/>
       </w:pPr>
-      <w:bookmarkStart w:id="7" w:name="_Toc244185073"/>
+      <w:bookmarkStart w:id="7" w:name="_Toc244185708"/>
       <w:r>
         <w:rPr>
           <w:sz w:val="30"/>
@@ -2561,7 +2561,7 @@
         <w:pStyle w:val="Ttulo2"/>
         <w:spacing w:before="240" w:after="120"/>
       </w:pPr>
-      <w:bookmarkStart w:id="8" w:name="_Toc244185074"/>
+      <w:bookmarkStart w:id="8" w:name="_Toc244185709"/>
       <w:r>
         <w:rPr>
           <w:sz w:val="25"/>
@@ -3018,7 +3018,7 @@
         <w:pStyle w:val="Ttulo2"/>
         <w:spacing w:before="240" w:after="120"/>
       </w:pPr>
-      <w:bookmarkStart w:id="9" w:name="_Toc244185075"/>
+      <w:bookmarkStart w:id="9" w:name="_Toc244185710"/>
       <w:r>
         <w:rPr>
           <w:sz w:val="25"/>
@@ -3209,7 +3209,7 @@
         <w:pStyle w:val="Ttulo2"/>
         <w:spacing w:before="240" w:after="120"/>
       </w:pPr>
-      <w:bookmarkStart w:id="10" w:name="_Toc244185076"/>
+      <w:bookmarkStart w:id="10" w:name="_Toc244185711"/>
       <w:r>
         <w:rPr>
           <w:sz w:val="25"/>
@@ -3282,7 +3282,7 @@
         <w:pStyle w:val="Ttulo1"/>
         <w:spacing w:before="360" w:after="120"/>
       </w:pPr>
-      <w:bookmarkStart w:id="11" w:name="_Toc244185077"/>
+      <w:bookmarkStart w:id="11" w:name="_Toc244185712"/>
       <w:r>
         <w:rPr>
           <w:sz w:val="30"/>
@@ -4820,7 +4820,7 @@
         <w:pStyle w:val="Ttulo1"/>
         <w:spacing w:before="360" w:after="120"/>
       </w:pPr>
-      <w:bookmarkStart w:id="12" w:name="_Toc244185078"/>
+      <w:bookmarkStart w:id="12" w:name="_Toc244185713"/>
       <w:r>
         <w:rPr>
           <w:sz w:val="30"/>
@@ -5222,7 +5222,7 @@
         <w:noProof/>
       </w:rPr>
       <w:drawing>
-        <wp:anchor distT="0" distB="0" distL="0" distR="0" simplePos="0" relativeHeight="251658240" behindDoc="0" locked="0" layoutInCell="1" hidden="0" allowOverlap="1" wp14:anchorId="42DCBFDE" wp14:editId="29B98875">
+        <wp:anchor distT="0" distB="0" distL="0" distR="0" simplePos="0" relativeHeight="251658240" behindDoc="0" locked="0" layoutInCell="1" hidden="0" allowOverlap="1" wp14:anchorId="05E6BC37" wp14:editId="7FCF458B">
           <wp:simplePos x="0" y="0"/>
           <wp:positionH relativeFrom="column">
             <wp:posOffset>-828673</wp:posOffset>
@@ -5309,16 +5309,16 @@
 <file path=word/numbering.xml><?xml version="1.0" encoding="utf-8"?>
 <w:numbering xmlns:wpc="http://schemas.microsoft.com/office/word/2010/wordprocessingCanvas" xmlns:cx="http://schemas.microsoft.com/office/drawing/2014/chartex" xmlns:cx1="http://schemas.microsoft.com/office/drawing/2015/9/8/chartex" xmlns:cx2="http://schemas.microsoft.com/office/drawing/2015/10/21/chartex" xmlns:cx3="http://schemas.microsoft.com/office/drawing/2016/5/9/chartex" xmlns:cx4="http://schemas.microsoft.com/office/drawing/2016/5/10/chartex" xmlns:cx5="http://schemas.microsoft.com/office/drawing/2016/5/11/chartex" xmlns:cx6="http://schemas.microsoft.com/office/drawing/2016/5/12/chartex" xmlns:cx7="http://schemas.microsoft.com/office/drawing/2016/5/13/chartex" xmlns:cx8="http://schemas.microsoft.com/office/drawing/2016/5/14/chartex" xmlns:mc="http://schemas.openxmlformats.org/markup-compatibility/2006" xmlns:aink="http://schemas.microsoft.com/office/drawing/2016/ink" xmlns:am3d="http://schemas.microsoft.com/office/drawing/2017/model3d" xmlns:o="urn:schemas-microsoft-com:office:office" xmlns:oel="http://schemas.microsoft.com/office/2019/extlst" xmlns:r="http://schemas.openxmlformats.org/officeDocument/2006/relationships" xmlns:m="http://schemas.openxmlformats.org/officeDocument/2006/math" xmlns:v="urn:schemas-microsoft-com:vml" xmlns:wp14="http://schemas.microsoft.com/office/word/2010/wordprocessingDrawing" xmlns:wp="http://schemas.openxmlformats.org/drawingml/2006/wordprocessingDrawing" xmlns:w10="urn:schemas-microsoft-com:office:word" xmlns:w="http://schemas.openxmlformats.org/wordprocessingml/2006/main" xmlns:w14="http://schemas.microsoft.com/office/word/2010/wordml" xmlns:w15="http://schemas.microsoft.com/office/word/2012/wordml" xmlns:w16cex="http://schemas.microsoft.com/office/word/2018/wordml/cex" xmlns:w16cid="http://schemas.microsoft.com/office/word/2016/wordml/cid" xmlns:w16="http://schemas.microsoft.com/office/word/2018/wordml" xmlns:w16du="http://schemas.microsoft.com/office/word/2023/wordml/word16du" xmlns:w16sdtdh="http://schemas.microsoft.com/office/word/2020/wordml/sdtdatahash" xmlns:w16sdtfl="http://schemas.microsoft.com/office/word/2024/wordml/sdtformatlock" xmlns:w16se="http://schemas.microsoft.com/office/word/2015/wordml/symex" xmlns:wpg="http://schemas.microsoft.com/office/word/2010/wordprocessingGroup" xmlns:wpi="http://schemas.microsoft.com/office/word/2010/wordprocessingInk" xmlns:wne="http://schemas.microsoft.com/office/word/2006/wordml" xmlns:wps="http://schemas.microsoft.com/office/word/2010/wordprocessingShape" mc:Ignorable="w14 w15 w16se w16cid w16 w16cex w16sdtdh w16sdtfl w16du wp14">
   <w:abstractNum w:abstractNumId="0" w15:restartNumberingAfterBreak="0">
-    <w:nsid w:val="285B70D4"/>
+    <w:nsid w:val="12EC1901"/>
     <w:multiLevelType w:val="singleLevel"/>
-    <w:tmpl w:val="A490CF56"/>
+    <w:tmpl w:val="06621E34"/>
     <w:lvl w:ilvl="0">
       <w:start w:val="1"/>
-      <w:numFmt w:val="bullet"/>
-      <w:lvlText w:val="•"/>
+      <w:numFmt w:val="decimal"/>
+      <w:lvlText w:val="%1."/>
       <w:lvlJc w:val="left"/>
       <w:pPr>
-        <w:ind w:left="567" w:hanging="283"/>
+        <w:ind w:left="567" w:hanging="340"/>
       </w:pPr>
       <w:rPr>
         <w:rFonts w:ascii="Calibri" w:eastAsia="Calibri" w:hAnsi="Calibri" w:cs="Calibri"/>
@@ -5326,24 +5326,24 @@
     </w:lvl>
   </w:abstractNum>
   <w:abstractNum w:abstractNumId="1" w15:restartNumberingAfterBreak="0">
-    <w:nsid w:val="4EC8018E"/>
+    <w:nsid w:val="2C962E06"/>
     <w:multiLevelType w:val="singleLevel"/>
-    <w:tmpl w:val="BCEC2E70"/>
+    <w:tmpl w:val="C9D44D56"/>
     <w:lvl w:ilvl="0">
       <w:start w:val="1"/>
-      <w:numFmt w:val="decimal"/>
-      <w:lvlText w:val="%1."/>
+      <w:numFmt w:val="bullet"/>
+      <w:lvlText w:val="•"/>
       <w:lvlJc w:val="left"/>
       <w:pPr>
-        <w:ind w:left="567" w:hanging="340"/>
+        <w:ind w:left="567" w:hanging="283"/>
       </w:pPr>
       <w:rPr>
         <w:rFonts w:ascii="Calibri" w:eastAsia="Calibri" w:hAnsi="Calibri" w:cs="Calibri"/>
       </w:rPr>
     </w:lvl>
   </w:abstractNum>
-  <w:num w:numId="1" w16cid:durableId="915549292">
-    <w:abstractNumId w:val="0"/>
+  <w:num w:numId="1" w16cid:durableId="1281574432">
+    <w:abstractNumId w:val="1"/>
   </w:num>
 </w:numbering>
 </file>
@@ -6072,7 +6072,7 @@
     <w:basedOn w:val="Fuentedeprrafopredeter"/>
     <w:uiPriority w:val="99"/>
     <w:unhideWhenUsed/>
-    <w:rsid w:val="003B3A2F"/>
+    <w:rsid w:val="00750936"/>
     <w:rPr>
       <w:color w:val="0000FF" w:themeColor="hyperlink"/>
       <w:u w:val="single"/>

</xml_diff>